<commit_message>
feat(potvrzeni): add donation confirmation fields for date, amount, and purpose
- Add datum, dar, and ucel fields to donation confirmation dialog
- Add validation for required fields in API route
- Auto-append Kč to amount if missing
- Add visual Kč suffix to amount input for better UX
- Add unit tests for template variable normalization
</commit_message>
<xml_diff>
--- a/public/potvrzeni.docx
+++ b/public/potvrzeni.docx
@@ -460,14 +460,14 @@
     <w:p>
       <w:pPr>
         <w:rPr>
-          <w:lang w:val="pl-PL"/>
-        </w:rPr>
-      </w:pPr>
-      <w:proofErr w:type="spellStart"/>
-      <w:r>
-        <w:rPr>
-          <w:rStyle w:val="dn"/>
-          <w:lang w:val="pl-PL"/>
+          <w:lang w:val="en-GB"/>
+        </w:rPr>
+      </w:pPr>
+      <w:proofErr w:type="spellStart"/>
+      <w:r>
+        <w:rPr>
+          <w:rStyle w:val="dn"/>
+          <w:lang w:val="en-GB"/>
         </w:rPr>
         <w:t>Sídlo</w:t>
       </w:r>
@@ -475,7 +475,7 @@
       <w:r>
         <w:rPr>
           <w:rStyle w:val="dn"/>
-          <w:lang w:val="pl-PL"/>
+          <w:lang w:val="en-GB"/>
         </w:rPr>
         <w:t xml:space="preserve">: K </w:t>
       </w:r>
@@ -483,7 +483,7 @@
       <w:r>
         <w:rPr>
           <w:rStyle w:val="dn"/>
-          <w:lang w:val="pl-PL"/>
+          <w:lang w:val="en-GB"/>
         </w:rPr>
         <w:t>Venerii</w:t>
       </w:r>
@@ -491,7 +491,7 @@
       <w:r>
         <w:rPr>
           <w:rStyle w:val="dn"/>
-          <w:lang w:val="pl-PL"/>
+          <w:lang w:val="en-GB"/>
         </w:rPr>
         <w:t xml:space="preserve"> 82, 691</w:t>
       </w:r>
@@ -506,31 +506,15 @@
       <w:r>
         <w:rPr>
           <w:rStyle w:val="dn"/>
-          <w:lang w:val="pl-PL"/>
-        </w:rPr>
-        <w:t xml:space="preserve">42 </w:t>
-      </w:r>
-      <w:proofErr w:type="spellStart"/>
-      <w:r>
-        <w:rPr>
-          <w:rStyle w:val="dn"/>
-          <w:lang w:val="pl-PL"/>
-        </w:rPr>
-        <w:t>Valtice</w:t>
-      </w:r>
-      <w:proofErr w:type="spellEnd"/>
-      <w:r>
-        <w:rPr>
-          <w:rStyle w:val="dn"/>
-          <w:lang w:val="pl-PL"/>
-        </w:rPr>
-        <w:t xml:space="preserve">, </w:t>
-      </w:r>
-      <w:proofErr w:type="spellStart"/>
-      <w:r>
-        <w:rPr>
-          <w:rStyle w:val="dn"/>
-          <w:lang w:val="pl-PL"/>
+          <w:lang w:val="en-GB"/>
+        </w:rPr>
+        <w:t xml:space="preserve">42 Valtice, </w:t>
+      </w:r>
+      <w:proofErr w:type="spellStart"/>
+      <w:r>
+        <w:rPr>
+          <w:rStyle w:val="dn"/>
+          <w:lang w:val="en-GB"/>
         </w:rPr>
         <w:t>Česká</w:t>
       </w:r>
@@ -538,21 +522,30 @@
       <w:r>
         <w:rPr>
           <w:rStyle w:val="dn"/>
-          <w:lang w:val="pl-PL"/>
-        </w:rPr>
-        <w:t xml:space="preserve"> republika</w:t>
-      </w:r>
-    </w:p>
-    <w:p>
-      <w:pPr>
-        <w:rPr>
-          <w:lang w:val="pl-PL"/>
-        </w:rPr>
-      </w:pPr>
-      <w:r>
-        <w:rPr>
-          <w:rStyle w:val="dn"/>
-          <w:lang w:val="pl-PL"/>
+          <w:lang w:val="en-GB"/>
+        </w:rPr>
+        <w:t xml:space="preserve"> </w:t>
+      </w:r>
+      <w:proofErr w:type="spellStart"/>
+      <w:r>
+        <w:rPr>
+          <w:rStyle w:val="dn"/>
+          <w:lang w:val="en-GB"/>
+        </w:rPr>
+        <w:t>republika</w:t>
+      </w:r>
+      <w:proofErr w:type="spellEnd"/>
+    </w:p>
+    <w:p>
+      <w:pPr>
+        <w:rPr>
+          <w:lang w:val="en-GB"/>
+        </w:rPr>
+      </w:pPr>
+      <w:r>
+        <w:rPr>
+          <w:rStyle w:val="dn"/>
+          <w:lang w:val="en-GB"/>
         </w:rPr>
         <w:t>IČO: 266</w:t>
       </w:r>
@@ -567,7 +560,7 @@
       <w:r>
         <w:rPr>
           <w:rStyle w:val="dn"/>
-          <w:lang w:val="pl-PL"/>
+          <w:lang w:val="en-GB"/>
         </w:rPr>
         <w:t>78</w:t>
       </w:r>
@@ -582,7 +575,7 @@
       <w:r>
         <w:rPr>
           <w:rStyle w:val="dn"/>
-          <w:lang w:val="pl-PL"/>
+          <w:lang w:val="en-GB"/>
         </w:rPr>
         <w:t xml:space="preserve">560  </w:t>
       </w:r>
@@ -590,30 +583,21 @@
     <w:p>
       <w:pPr>
         <w:rPr>
-          <w:lang w:val="pl-PL"/>
-        </w:rPr>
-      </w:pPr>
-      <w:proofErr w:type="spellStart"/>
-      <w:r>
-        <w:rPr>
-          <w:rStyle w:val="dn"/>
-          <w:lang w:val="pl-PL"/>
-        </w:rPr>
-        <w:t>Zastoupený</w:t>
-      </w:r>
-      <w:proofErr w:type="spellEnd"/>
-      <w:r>
-        <w:rPr>
-          <w:rStyle w:val="dn"/>
-          <w:lang w:val="pl-PL"/>
-        </w:rPr>
-        <w:t xml:space="preserve">: </w:t>
-      </w:r>
-      <w:proofErr w:type="spellStart"/>
-      <w:r>
-        <w:rPr>
-          <w:rStyle w:val="dn"/>
-          <w:lang w:val="pl-PL"/>
+          <w:lang w:val="en-GB"/>
+        </w:rPr>
+      </w:pPr>
+      <w:r>
+        <w:rPr>
+          <w:rStyle w:val="dn"/>
+          <w:lang w:val="en-GB"/>
+        </w:rPr>
+        <w:t xml:space="preserve">Zastoupený: </w:t>
+      </w:r>
+      <w:proofErr w:type="spellStart"/>
+      <w:r>
+        <w:rPr>
+          <w:rStyle w:val="dn"/>
+          <w:lang w:val="en-GB"/>
         </w:rPr>
         <w:t>Barborou</w:t>
       </w:r>
@@ -626,19 +610,72 @@
         </w:rPr>
         <w:t> </w:t>
       </w:r>
-      <w:proofErr w:type="spellStart"/>
-      <w:r>
-        <w:rPr>
-          <w:rStyle w:val="dn"/>
-          <w:lang w:val="pl-PL"/>
-        </w:rPr>
-        <w:t>Sládkovou</w:t>
-      </w:r>
-      <w:proofErr w:type="spellEnd"/>
-      <w:r>
-        <w:rPr>
-          <w:rStyle w:val="dn"/>
-          <w:lang w:val="pl-PL"/>
+      <w:r>
+        <w:rPr>
+          <w:rStyle w:val="dn"/>
+          <w:lang w:val="en-GB"/>
+        </w:rPr>
+        <w:t xml:space="preserve">Sládkovou, </w:t>
+      </w:r>
+      <w:proofErr w:type="spellStart"/>
+      <w:r>
+        <w:rPr>
+          <w:rStyle w:val="dn"/>
+          <w:lang w:val="en-GB"/>
+        </w:rPr>
+        <w:t>výkonnou</w:t>
+      </w:r>
+      <w:proofErr w:type="spellEnd"/>
+      <w:r>
+        <w:rPr>
+          <w:rStyle w:val="dn"/>
+          <w:lang w:val="en-GB"/>
+        </w:rPr>
+        <w:t xml:space="preserve"> </w:t>
+      </w:r>
+      <w:proofErr w:type="spellStart"/>
+      <w:r>
+        <w:rPr>
+          <w:rStyle w:val="dn"/>
+          <w:lang w:val="en-GB"/>
+        </w:rPr>
+        <w:t>sekretářkou</w:t>
+      </w:r>
+      <w:proofErr w:type="spellEnd"/>
+    </w:p>
+    <w:p>
+      <w:pPr>
+        <w:rPr>
+          <w:lang w:val="en-GB"/>
+        </w:rPr>
+      </w:pPr>
+    </w:p>
+    <w:p>
+      <w:pPr>
+        <w:rPr>
+          <w:lang w:val="en-GB"/>
+        </w:rPr>
+      </w:pPr>
+    </w:p>
+    <w:p>
+      <w:pPr>
+        <w:rPr>
+          <w:lang w:val="en-GB"/>
+        </w:rPr>
+      </w:pPr>
+      <w:proofErr w:type="spellStart"/>
+      <w:r>
+        <w:rPr>
+          <w:rStyle w:val="dn"/>
+          <w:lang w:val="en-GB"/>
+        </w:rPr>
+        <w:t>Potvrzujeme</w:t>
+      </w:r>
+      <w:proofErr w:type="spellEnd"/>
+      <w:r>
+        <w:rPr>
+          <w:rStyle w:val="dn"/>
+          <w:lang w:val="en-GB"/>
         </w:rPr>
         <w:t xml:space="preserve">, </w:t>
       </w:r>
@@ -646,15 +683,15 @@
       <w:r>
         <w:rPr>
           <w:rStyle w:val="dn"/>
-          <w:lang w:val="pl-PL"/>
-        </w:rPr>
-        <w:t>výkonnou</w:t>
-      </w:r>
-      <w:proofErr w:type="spellEnd"/>
-      <w:r>
-        <w:rPr>
-          <w:rStyle w:val="dn"/>
-          <w:lang w:val="pl-PL"/>
+          <w:lang w:val="en-GB"/>
+        </w:rPr>
+        <w:t>že</w:t>
+      </w:r>
+      <w:proofErr w:type="spellEnd"/>
+      <w:r>
+        <w:rPr>
+          <w:rStyle w:val="dn"/>
+          <w:lang w:val="en-GB"/>
         </w:rPr>
         <w:t xml:space="preserve"> </w:t>
       </w:r>
@@ -662,61 +699,15 @@
       <w:r>
         <w:rPr>
           <w:rStyle w:val="dn"/>
-          <w:lang w:val="pl-PL"/>
-        </w:rPr>
-        <w:t>sekretářkou</w:t>
-      </w:r>
-      <w:proofErr w:type="spellEnd"/>
-    </w:p>
-    <w:p>
-      <w:pPr>
-        <w:rPr>
-          <w:lang w:val="pl-PL"/>
-        </w:rPr>
-      </w:pPr>
-    </w:p>
-    <w:p>
-      <w:pPr>
-        <w:rPr>
-          <w:lang w:val="pl-PL"/>
-        </w:rPr>
-      </w:pPr>
-    </w:p>
-    <w:p>
-      <w:pPr>
-        <w:rPr>
-          <w:lang w:val="pl-PL"/>
-        </w:rPr>
-      </w:pPr>
-      <w:proofErr w:type="spellStart"/>
-      <w:r>
-        <w:rPr>
-          <w:rStyle w:val="dn"/>
-          <w:lang w:val="pl-PL"/>
-        </w:rPr>
-        <w:t>Potvrzujeme</w:t>
-      </w:r>
-      <w:proofErr w:type="spellEnd"/>
-      <w:r>
-        <w:rPr>
-          <w:rStyle w:val="dn"/>
-          <w:lang w:val="pl-PL"/>
-        </w:rPr>
-        <w:t xml:space="preserve">, </w:t>
-      </w:r>
-      <w:proofErr w:type="spellStart"/>
-      <w:r>
-        <w:rPr>
-          <w:rStyle w:val="dn"/>
-          <w:lang w:val="pl-PL"/>
-        </w:rPr>
-        <w:t>že</w:t>
-      </w:r>
-      <w:proofErr w:type="spellEnd"/>
-      <w:r>
-        <w:rPr>
-          <w:rStyle w:val="dn"/>
-          <w:lang w:val="pl-PL"/>
+          <w:lang w:val="en-GB"/>
+        </w:rPr>
+        <w:t>jsme</w:t>
+      </w:r>
+      <w:proofErr w:type="spellEnd"/>
+      <w:r>
+        <w:rPr>
+          <w:rStyle w:val="dn"/>
+          <w:lang w:val="en-GB"/>
         </w:rPr>
         <w:t xml:space="preserve"> </w:t>
       </w:r>
@@ -724,55 +715,69 @@
       <w:r>
         <w:rPr>
           <w:rStyle w:val="dn"/>
-          <w:lang w:val="pl-PL"/>
-        </w:rPr>
-        <w:t>jsme</w:t>
-      </w:r>
-      <w:proofErr w:type="spellEnd"/>
-      <w:r>
-        <w:rPr>
-          <w:rStyle w:val="dn"/>
-          <w:lang w:val="pl-PL"/>
+          <w:lang w:val="en-GB"/>
+        </w:rPr>
+        <w:t>dne</w:t>
+      </w:r>
+      <w:proofErr w:type="spellEnd"/>
+      <w:r>
+        <w:rPr>
+          <w:rStyle w:val="dn"/>
+          <w:lang w:val="en-GB"/>
         </w:rPr>
         <w:t xml:space="preserve"> </w:t>
       </w:r>
-      <w:proofErr w:type="spellStart"/>
-      <w:r>
-        <w:rPr>
-          <w:rStyle w:val="dn"/>
-          <w:lang w:val="pl-PL"/>
-        </w:rPr>
-        <w:t>dne</w:t>
-      </w:r>
-      <w:proofErr w:type="spellEnd"/>
-      <w:r>
-        <w:rPr>
-          <w:rStyle w:val="dn"/>
-          <w:lang w:val="pl-PL"/>
-        </w:rPr>
-        <w:t xml:space="preserve"> 19.6. 2025 </w:t>
-      </w:r>
-      <w:proofErr w:type="spellStart"/>
-      <w:r>
-        <w:rPr>
-          <w:rStyle w:val="dn"/>
-          <w:lang w:val="pl-PL"/>
-        </w:rPr>
-        <w:t>přijali</w:t>
-      </w:r>
-      <w:proofErr w:type="spellEnd"/>
-      <w:r>
-        <w:rPr>
-          <w:rStyle w:val="dn"/>
-          <w:lang w:val="pl-PL"/>
-        </w:rPr>
-        <w:t xml:space="preserve"> dar od </w:t>
-      </w:r>
-      <w:proofErr w:type="spellStart"/>
-      <w:r>
-        <w:rPr>
-          <w:rStyle w:val="dn"/>
-          <w:lang w:val="pl-PL"/>
+      <w:r>
+        <w:rPr>
+          <w:rStyle w:val="dn"/>
+          <w:lang w:val="en-GB"/>
+        </w:rPr>
+        <w:t>{datum}</w:t>
+      </w:r>
+      <w:r>
+        <w:rPr>
+          <w:rStyle w:val="dn"/>
+          <w:lang w:val="en-GB"/>
+        </w:rPr>
+        <w:t xml:space="preserve"> p</w:t>
+      </w:r>
+      <w:proofErr w:type="spellStart"/>
+      <w:r>
+        <w:rPr>
+          <w:rStyle w:val="dn"/>
+          <w:lang w:val="en-GB"/>
+        </w:rPr>
+        <w:t>řijali</w:t>
+      </w:r>
+      <w:proofErr w:type="spellEnd"/>
+      <w:r>
+        <w:rPr>
+          <w:rStyle w:val="dn"/>
+          <w:lang w:val="en-GB"/>
+        </w:rPr>
+        <w:t xml:space="preserve"> </w:t>
+      </w:r>
+      <w:proofErr w:type="spellStart"/>
+      <w:r>
+        <w:rPr>
+          <w:rStyle w:val="dn"/>
+          <w:lang w:val="en-GB"/>
+        </w:rPr>
+        <w:t>dar</w:t>
+      </w:r>
+      <w:proofErr w:type="spellEnd"/>
+      <w:r>
+        <w:rPr>
+          <w:rStyle w:val="dn"/>
+          <w:lang w:val="en-GB"/>
+        </w:rPr>
+        <w:t xml:space="preserve"> od </w:t>
+      </w:r>
+      <w:proofErr w:type="spellStart"/>
+      <w:r>
+        <w:rPr>
+          <w:rStyle w:val="dn"/>
+          <w:lang w:val="en-GB"/>
         </w:rPr>
         <w:t>dá</w:t>
       </w:r>
@@ -795,7 +800,7 @@
       <w:r>
         <w:rPr>
           <w:rStyle w:val="dn"/>
-          <w:lang w:val="pl-PL"/>
+          <w:lang w:val="en-GB"/>
         </w:rPr>
         <w:t>ýše</w:t>
       </w:r>
@@ -803,7 +808,7 @@
       <w:r>
         <w:rPr>
           <w:rStyle w:val="dn"/>
-          <w:lang w:val="pl-PL"/>
+          <w:lang w:val="en-GB"/>
         </w:rPr>
         <w:t xml:space="preserve"> </w:t>
       </w:r>
@@ -811,7 +816,7 @@
       <w:r>
         <w:rPr>
           <w:rStyle w:val="dn"/>
-          <w:lang w:val="pl-PL"/>
+          <w:lang w:val="en-GB"/>
         </w:rPr>
         <w:t>uveden</w:t>
       </w:r>
@@ -840,67 +845,7 @@
       <w:r>
         <w:rPr>
           <w:rStyle w:val="dn"/>
-          <w:lang w:val="pl-PL"/>
-        </w:rPr>
-        <w:tab/>
-      </w:r>
-      <w:r>
-        <w:rPr>
-          <w:rStyle w:val="dn"/>
-          <w:lang w:val="pl-PL"/>
-        </w:rPr>
-        <w:t>•</w:t>
-      </w:r>
-      <w:r>
-        <w:rPr>
-          <w:rStyle w:val="dn"/>
-          <w:lang w:val="pl-PL"/>
-        </w:rPr>
-        <w:tab/>
-      </w:r>
-      <w:proofErr w:type="spellStart"/>
-      <w:r>
-        <w:rPr>
-          <w:rStyle w:val="dn"/>
-          <w:lang w:val="pl-PL"/>
-        </w:rPr>
-        <w:t>Výš</w:t>
-      </w:r>
-      <w:proofErr w:type="spellEnd"/>
-      <w:r>
-        <w:rPr>
-          <w:rStyle w:val="dn"/>
-          <w:lang w:val="de-DE"/>
-        </w:rPr>
-        <w:t xml:space="preserve">e </w:t>
-      </w:r>
-      <w:proofErr w:type="spellStart"/>
-      <w:r>
-        <w:rPr>
-          <w:rStyle w:val="dn"/>
-          <w:lang w:val="de-DE"/>
-        </w:rPr>
-        <w:t>daru</w:t>
-      </w:r>
-      <w:proofErr w:type="spellEnd"/>
-      <w:r>
-        <w:rPr>
-          <w:rStyle w:val="dn"/>
-          <w:lang w:val="de-DE"/>
-        </w:rPr>
-        <w:t>:</w:t>
-      </w:r>
-    </w:p>
-    <w:p>
-      <w:pPr>
-        <w:rPr>
-          <w:lang w:val="pl-PL"/>
-        </w:rPr>
-      </w:pPr>
-      <w:r>
-        <w:rPr>
-          <w:rStyle w:val="dn"/>
-          <w:lang w:val="pl-PL"/>
+          <w:lang w:val="en-GB"/>
         </w:rPr>
         <w:tab/>
         <w:t>•</w:t>
@@ -908,31 +853,67 @@
       <w:r>
         <w:rPr>
           <w:rStyle w:val="dn"/>
-          <w:lang w:val="pl-PL"/>
+          <w:lang w:val="en-GB"/>
         </w:rPr>
         <w:tab/>
-        <w:t xml:space="preserve">Forma daru: </w:t>
-      </w:r>
-      <w:proofErr w:type="spellStart"/>
-      <w:r>
-        <w:rPr>
-          <w:rStyle w:val="dn"/>
-          <w:lang w:val="pl-PL"/>
-        </w:rPr>
-        <w:t>peněžitý</w:t>
-      </w:r>
-      <w:proofErr w:type="spellEnd"/>
-    </w:p>
-    <w:p>
-      <w:pPr>
-        <w:rPr>
-          <w:lang w:val="pl-PL"/>
-        </w:rPr>
-      </w:pPr>
-      <w:r>
-        <w:rPr>
-          <w:rStyle w:val="dn"/>
-          <w:lang w:val="pl-PL"/>
+      </w:r>
+      <w:proofErr w:type="spellStart"/>
+      <w:r>
+        <w:rPr>
+          <w:rStyle w:val="dn"/>
+          <w:lang w:val="en-GB"/>
+        </w:rPr>
+        <w:t>Výš</w:t>
+      </w:r>
+      <w:proofErr w:type="spellEnd"/>
+      <w:r>
+        <w:rPr>
+          <w:rStyle w:val="dn"/>
+          <w:lang w:val="de-DE"/>
+        </w:rPr>
+        <w:t xml:space="preserve">e </w:t>
+      </w:r>
+      <w:proofErr w:type="spellStart"/>
+      <w:r>
+        <w:rPr>
+          <w:rStyle w:val="dn"/>
+          <w:lang w:val="de-DE"/>
+        </w:rPr>
+        <w:t>daru</w:t>
+      </w:r>
+      <w:proofErr w:type="spellEnd"/>
+      <w:r>
+        <w:rPr>
+          <w:rStyle w:val="dn"/>
+          <w:lang w:val="de-DE"/>
+        </w:rPr>
+        <w:t>:</w:t>
+      </w:r>
+      <w:r>
+        <w:rPr>
+          <w:rStyle w:val="dn"/>
+          <w:lang w:val="de-DE"/>
+        </w:rPr>
+        <w:t xml:space="preserve"> </w:t>
+      </w:r>
+      <w:r>
+        <w:rPr>
+          <w:rStyle w:val="dn"/>
+          <w:lang w:val="pl-PL"/>
+        </w:rPr>
+        <w:t>{dar}</w:t>
+      </w:r>
+    </w:p>
+    <w:p>
+      <w:pPr>
+        <w:rPr>
+          <w:lang w:val="en-GB"/>
+        </w:rPr>
+      </w:pPr>
+      <w:r>
+        <w:rPr>
+          <w:rStyle w:val="dn"/>
+          <w:lang w:val="en-GB"/>
         </w:rPr>
         <w:tab/>
         <w:t>•</w:t>
@@ -940,15 +921,63 @@
       <w:r>
         <w:rPr>
           <w:rStyle w:val="dn"/>
-          <w:lang w:val="pl-PL"/>
+          <w:lang w:val="en-GB"/>
         </w:rPr>
         <w:tab/>
-      </w:r>
-      <w:proofErr w:type="spellStart"/>
-      <w:r>
-        <w:rPr>
-          <w:rStyle w:val="dn"/>
-          <w:lang w:val="pl-PL"/>
+        <w:t xml:space="preserve">Forma </w:t>
+      </w:r>
+      <w:proofErr w:type="spellStart"/>
+      <w:r>
+        <w:rPr>
+          <w:rStyle w:val="dn"/>
+          <w:lang w:val="en-GB"/>
+        </w:rPr>
+        <w:t>daru</w:t>
+      </w:r>
+      <w:proofErr w:type="spellEnd"/>
+      <w:r>
+        <w:rPr>
+          <w:rStyle w:val="dn"/>
+          <w:lang w:val="en-GB"/>
+        </w:rPr>
+        <w:t xml:space="preserve">: </w:t>
+      </w:r>
+      <w:proofErr w:type="spellStart"/>
+      <w:r>
+        <w:rPr>
+          <w:rStyle w:val="dn"/>
+          <w:lang w:val="en-GB"/>
+        </w:rPr>
+        <w:t>peněžitý</w:t>
+      </w:r>
+      <w:proofErr w:type="spellEnd"/>
+    </w:p>
+    <w:p>
+      <w:pPr>
+        <w:rPr>
+          <w:lang w:val="en-GB"/>
+        </w:rPr>
+      </w:pPr>
+      <w:r>
+        <w:rPr>
+          <w:rStyle w:val="dn"/>
+          <w:lang w:val="en-GB"/>
+        </w:rPr>
+        <w:tab/>
+        <w:t>•</w:t>
+      </w:r>
+      <w:r>
+        <w:rPr>
+          <w:rStyle w:val="dn"/>
+          <w:lang w:val="en-GB"/>
+        </w:rPr>
+        <w:tab/>
+      </w:r>
+      <w:proofErr w:type="spellStart"/>
+      <w:r>
+        <w:rPr>
+          <w:rStyle w:val="dn"/>
+          <w:lang w:val="en-GB"/>
         </w:rPr>
         <w:t>Účel</w:t>
       </w:r>
@@ -956,39 +985,113 @@
       <w:r>
         <w:rPr>
           <w:rStyle w:val="dn"/>
-          <w:lang w:val="pl-PL"/>
-        </w:rPr>
-        <w:t xml:space="preserve"> daru: podpora </w:t>
-      </w:r>
-      <w:proofErr w:type="spellStart"/>
-      <w:r>
-        <w:rPr>
-          <w:rStyle w:val="dn"/>
-          <w:lang w:val="pl-PL"/>
-        </w:rPr>
-        <w:t>Handicampu</w:t>
-      </w:r>
-      <w:proofErr w:type="spellEnd"/>
-      <w:r>
-        <w:rPr>
-          <w:rStyle w:val="dn"/>
-          <w:lang w:val="pl-PL"/>
-        </w:rPr>
-        <w:t xml:space="preserve"> 2026, </w:t>
-      </w:r>
-      <w:proofErr w:type="spellStart"/>
-      <w:r>
-        <w:rPr>
-          <w:rStyle w:val="dn"/>
-          <w:lang w:val="pl-PL"/>
-        </w:rPr>
-        <w:t>tábora</w:t>
-      </w:r>
-      <w:proofErr w:type="spellEnd"/>
-      <w:r>
-        <w:rPr>
-          <w:rStyle w:val="dn"/>
-          <w:lang w:val="pl-PL"/>
+          <w:lang w:val="en-GB"/>
+        </w:rPr>
+        <w:t xml:space="preserve"> </w:t>
+      </w:r>
+      <w:proofErr w:type="spellStart"/>
+      <w:r>
+        <w:rPr>
+          <w:rStyle w:val="dn"/>
+          <w:lang w:val="en-GB"/>
+        </w:rPr>
+        <w:t>daru</w:t>
+      </w:r>
+      <w:proofErr w:type="spellEnd"/>
+      <w:r>
+        <w:rPr>
+          <w:rStyle w:val="dn"/>
+          <w:lang w:val="en-GB"/>
+        </w:rPr>
+        <w:t xml:space="preserve">: </w:t>
+      </w:r>
+      <w:r>
+        <w:rPr>
+          <w:rStyle w:val="dn"/>
+          <w:lang w:val="en-GB"/>
+        </w:rPr>
+        <w:t>{</w:t>
+      </w:r>
+      <w:proofErr w:type="spellStart"/>
+      <w:r>
+        <w:rPr>
+          <w:rStyle w:val="dn"/>
+          <w:lang w:val="en-GB"/>
+        </w:rPr>
+        <w:t>ucel</w:t>
+      </w:r>
+      <w:proofErr w:type="spellEnd"/>
+      <w:r>
+        <w:rPr>
+          <w:rStyle w:val="dn"/>
+          <w:lang w:val="en-GB"/>
+        </w:rPr>
+        <w:t>}</w:t>
+      </w:r>
+    </w:p>
+    <w:p>
+      <w:pPr>
+        <w:rPr>
+          <w:lang w:val="en-GB"/>
+        </w:rPr>
+      </w:pPr>
+    </w:p>
+    <w:p>
+      <w:pPr>
+        <w:rPr>
+          <w:lang w:val="en-GB"/>
+        </w:rPr>
+      </w:pPr>
+    </w:p>
+    <w:p>
+      <w:pPr>
+        <w:rPr>
+          <w:lang w:val="en-GB"/>
+        </w:rPr>
+      </w:pPr>
+      <w:r>
+        <w:rPr>
+          <w:rStyle w:val="dn"/>
+          <w:lang w:val="pt-PT"/>
+        </w:rPr>
+        <w:t xml:space="preserve">Tento dar </w:t>
+      </w:r>
+      <w:proofErr w:type="spellStart"/>
+      <w:r>
+        <w:rPr>
+          <w:rStyle w:val="dn"/>
+          <w:lang w:val="pt-PT"/>
+        </w:rPr>
+        <w:t>spl</w:t>
+      </w:r>
+      <w:r>
+        <w:rPr>
+          <w:rStyle w:val="dn"/>
+          <w:lang w:val="en-GB"/>
+        </w:rPr>
+        <w:t>ňuje</w:t>
+      </w:r>
+      <w:proofErr w:type="spellEnd"/>
+      <w:r>
+        <w:rPr>
+          <w:rStyle w:val="dn"/>
+          <w:lang w:val="en-GB"/>
+        </w:rPr>
+        <w:t xml:space="preserve"> </w:t>
+      </w:r>
+      <w:proofErr w:type="spellStart"/>
+      <w:r>
+        <w:rPr>
+          <w:rStyle w:val="dn"/>
+          <w:lang w:val="en-GB"/>
+        </w:rPr>
+        <w:t>podmínky</w:t>
+      </w:r>
+      <w:proofErr w:type="spellEnd"/>
+      <w:r>
+        <w:rPr>
+          <w:rStyle w:val="dn"/>
+          <w:lang w:val="en-GB"/>
         </w:rPr>
         <w:t xml:space="preserve"> pro </w:t>
       </w:r>
@@ -996,15 +1099,15 @@
       <w:r>
         <w:rPr>
           <w:rStyle w:val="dn"/>
-          <w:lang w:val="pl-PL"/>
-        </w:rPr>
-        <w:t>tělesně</w:t>
-      </w:r>
-      <w:proofErr w:type="spellEnd"/>
-      <w:r>
-        <w:rPr>
-          <w:rStyle w:val="dn"/>
-          <w:lang w:val="pl-PL"/>
+          <w:lang w:val="en-GB"/>
+        </w:rPr>
+        <w:t>uplatnění</w:t>
+      </w:r>
+      <w:proofErr w:type="spellEnd"/>
+      <w:r>
+        <w:rPr>
+          <w:rStyle w:val="dn"/>
+          <w:lang w:val="en-GB"/>
         </w:rPr>
         <w:t xml:space="preserve"> </w:t>
       </w:r>
@@ -1012,15 +1115,31 @@
       <w:r>
         <w:rPr>
           <w:rStyle w:val="dn"/>
-          <w:lang w:val="pl-PL"/>
-        </w:rPr>
-        <w:t>postiženou</w:t>
-      </w:r>
-      <w:proofErr w:type="spellEnd"/>
-      <w:r>
-        <w:rPr>
-          <w:rStyle w:val="dn"/>
-          <w:lang w:val="pl-PL"/>
+          <w:lang w:val="en-GB"/>
+        </w:rPr>
+        <w:t>odpočtu</w:t>
+      </w:r>
+      <w:proofErr w:type="spellEnd"/>
+      <w:r>
+        <w:rPr>
+          <w:rStyle w:val="dn"/>
+          <w:lang w:val="en-GB"/>
+        </w:rPr>
+        <w:t xml:space="preserve"> ze </w:t>
+      </w:r>
+      <w:proofErr w:type="spellStart"/>
+      <w:r>
+        <w:rPr>
+          <w:rStyle w:val="dn"/>
+          <w:lang w:val="en-GB"/>
+        </w:rPr>
+        <w:t>základu</w:t>
+      </w:r>
+      <w:proofErr w:type="spellEnd"/>
+      <w:r>
+        <w:rPr>
+          <w:rStyle w:val="dn"/>
+          <w:lang w:val="en-GB"/>
         </w:rPr>
         <w:t xml:space="preserve"> </w:t>
       </w:r>
@@ -1028,59 +1147,15 @@
       <w:r>
         <w:rPr>
           <w:rStyle w:val="dn"/>
-          <w:lang w:val="pl-PL"/>
-        </w:rPr>
-        <w:t>mládež</w:t>
-      </w:r>
-      <w:proofErr w:type="spellEnd"/>
-    </w:p>
-    <w:p>
-      <w:pPr>
-        <w:rPr>
-          <w:lang w:val="pl-PL"/>
-        </w:rPr>
-      </w:pPr>
-    </w:p>
-    <w:p>
-      <w:pPr>
-        <w:rPr>
-          <w:lang w:val="pl-PL"/>
-        </w:rPr>
-      </w:pPr>
-    </w:p>
-    <w:p>
-      <w:pPr>
-        <w:rPr>
-          <w:lang w:val="pl-PL"/>
-        </w:rPr>
-      </w:pPr>
-      <w:r>
-        <w:rPr>
-          <w:rStyle w:val="dn"/>
-          <w:lang w:val="pt-PT"/>
-        </w:rPr>
-        <w:t xml:space="preserve">Tento dar </w:t>
-      </w:r>
-      <w:proofErr w:type="spellStart"/>
-      <w:r>
-        <w:rPr>
-          <w:rStyle w:val="dn"/>
-          <w:lang w:val="pt-PT"/>
-        </w:rPr>
-        <w:t>spl</w:t>
-      </w:r>
-      <w:r>
-        <w:rPr>
-          <w:rStyle w:val="dn"/>
-          <w:lang w:val="pl-PL"/>
-        </w:rPr>
-        <w:t>ňuje</w:t>
-      </w:r>
-      <w:proofErr w:type="spellEnd"/>
-      <w:r>
-        <w:rPr>
-          <w:rStyle w:val="dn"/>
-          <w:lang w:val="pl-PL"/>
+          <w:lang w:val="en-GB"/>
+        </w:rPr>
+        <w:t>daně</w:t>
+      </w:r>
+      <w:proofErr w:type="spellEnd"/>
+      <w:r>
+        <w:rPr>
+          <w:rStyle w:val="dn"/>
+          <w:lang w:val="en-GB"/>
         </w:rPr>
         <w:t xml:space="preserve"> </w:t>
       </w:r>
@@ -1088,87 +1163,7 @@
       <w:r>
         <w:rPr>
           <w:rStyle w:val="dn"/>
-          <w:lang w:val="pl-PL"/>
-        </w:rPr>
-        <w:t>podmínky</w:t>
-      </w:r>
-      <w:proofErr w:type="spellEnd"/>
-      <w:r>
-        <w:rPr>
-          <w:rStyle w:val="dn"/>
-          <w:lang w:val="pl-PL"/>
-        </w:rPr>
-        <w:t xml:space="preserve"> pro </w:t>
-      </w:r>
-      <w:proofErr w:type="spellStart"/>
-      <w:r>
-        <w:rPr>
-          <w:rStyle w:val="dn"/>
-          <w:lang w:val="pl-PL"/>
-        </w:rPr>
-        <w:t>uplatnění</w:t>
-      </w:r>
-      <w:proofErr w:type="spellEnd"/>
-      <w:r>
-        <w:rPr>
-          <w:rStyle w:val="dn"/>
-          <w:lang w:val="pl-PL"/>
-        </w:rPr>
-        <w:t xml:space="preserve"> </w:t>
-      </w:r>
-      <w:proofErr w:type="spellStart"/>
-      <w:r>
-        <w:rPr>
-          <w:rStyle w:val="dn"/>
-          <w:lang w:val="pl-PL"/>
-        </w:rPr>
-        <w:t>odpočtu</w:t>
-      </w:r>
-      <w:proofErr w:type="spellEnd"/>
-      <w:r>
-        <w:rPr>
-          <w:rStyle w:val="dn"/>
-          <w:lang w:val="pl-PL"/>
-        </w:rPr>
-        <w:t xml:space="preserve"> ze </w:t>
-      </w:r>
-      <w:proofErr w:type="spellStart"/>
-      <w:r>
-        <w:rPr>
-          <w:rStyle w:val="dn"/>
-          <w:lang w:val="pl-PL"/>
-        </w:rPr>
-        <w:t>základu</w:t>
-      </w:r>
-      <w:proofErr w:type="spellEnd"/>
-      <w:r>
-        <w:rPr>
-          <w:rStyle w:val="dn"/>
-          <w:lang w:val="pl-PL"/>
-        </w:rPr>
-        <w:t xml:space="preserve"> </w:t>
-      </w:r>
-      <w:proofErr w:type="spellStart"/>
-      <w:r>
-        <w:rPr>
-          <w:rStyle w:val="dn"/>
-          <w:lang w:val="pl-PL"/>
-        </w:rPr>
-        <w:t>daně</w:t>
-      </w:r>
-      <w:proofErr w:type="spellEnd"/>
-      <w:r>
-        <w:rPr>
-          <w:rStyle w:val="dn"/>
-          <w:lang w:val="pl-PL"/>
-        </w:rPr>
-        <w:t xml:space="preserve"> </w:t>
-      </w:r>
-      <w:proofErr w:type="spellStart"/>
-      <w:r>
-        <w:rPr>
-          <w:rStyle w:val="dn"/>
-          <w:lang w:val="pl-PL"/>
+          <w:lang w:val="en-GB"/>
         </w:rPr>
         <w:t>dle</w:t>
       </w:r>
@@ -1176,7 +1171,7 @@
       <w:r>
         <w:rPr>
           <w:rStyle w:val="dn"/>
-          <w:lang w:val="pl-PL"/>
+          <w:lang w:val="en-GB"/>
         </w:rPr>
         <w:t xml:space="preserve"> §</w:t>
       </w:r>
@@ -1191,7 +1186,7 @@
       <w:r>
         <w:rPr>
           <w:rStyle w:val="dn"/>
-          <w:lang w:val="pl-PL"/>
+          <w:lang w:val="en-GB"/>
         </w:rPr>
         <w:t>15</w:t>
       </w:r>
@@ -1207,7 +1202,7 @@
       <w:r>
         <w:rPr>
           <w:rStyle w:val="dn"/>
-          <w:lang w:val="pl-PL"/>
+          <w:lang w:val="en-GB"/>
         </w:rPr>
         <w:t>odst</w:t>
       </w:r>
@@ -1215,7 +1210,7 @@
       <w:r>
         <w:rPr>
           <w:rStyle w:val="dn"/>
-          <w:lang w:val="pl-PL"/>
+          <w:lang w:val="en-GB"/>
         </w:rPr>
         <w:t>.</w:t>
       </w:r>
@@ -1238,7 +1233,7 @@
       <w:r>
         <w:rPr>
           <w:rStyle w:val="dn"/>
-          <w:lang w:val="pl-PL"/>
+          <w:lang w:val="en-GB"/>
         </w:rPr>
         <w:t>ákona</w:t>
       </w:r>
@@ -1246,7 +1241,7 @@
       <w:r>
         <w:rPr>
           <w:rStyle w:val="dn"/>
-          <w:lang w:val="pl-PL"/>
+          <w:lang w:val="en-GB"/>
         </w:rPr>
         <w:t xml:space="preserve"> č.</w:t>
       </w:r>
@@ -1261,7 +1256,7 @@
       <w:r>
         <w:rPr>
           <w:rStyle w:val="dn"/>
-          <w:lang w:val="pl-PL"/>
+          <w:lang w:val="en-GB"/>
         </w:rPr>
         <w:t xml:space="preserve">586/1992 Sb. (pro </w:t>
       </w:r>
@@ -1269,7 +1264,7 @@
       <w:r>
         <w:rPr>
           <w:rStyle w:val="dn"/>
-          <w:lang w:val="pl-PL"/>
+          <w:lang w:val="en-GB"/>
         </w:rPr>
         <w:t>fyzick</w:t>
       </w:r>
@@ -1281,18 +1276,27 @@
         </w:rPr>
         <w:t xml:space="preserve">é </w:t>
       </w:r>
-      <w:r>
-        <w:rPr>
-          <w:rStyle w:val="dn"/>
-          <w:lang w:val="pl-PL"/>
-        </w:rPr>
-        <w:t xml:space="preserve">osoby) </w:t>
-      </w:r>
-      <w:proofErr w:type="spellStart"/>
-      <w:r>
-        <w:rPr>
-          <w:rStyle w:val="dn"/>
-          <w:lang w:val="pl-PL"/>
+      <w:proofErr w:type="spellStart"/>
+      <w:r>
+        <w:rPr>
+          <w:rStyle w:val="dn"/>
+          <w:lang w:val="en-GB"/>
+        </w:rPr>
+        <w:t>osoby</w:t>
+      </w:r>
+      <w:proofErr w:type="spellEnd"/>
+      <w:r>
+        <w:rPr>
+          <w:rStyle w:val="dn"/>
+          <w:lang w:val="en-GB"/>
+        </w:rPr>
+        <w:t xml:space="preserve">) </w:t>
+      </w:r>
+      <w:proofErr w:type="spellStart"/>
+      <w:r>
+        <w:rPr>
+          <w:rStyle w:val="dn"/>
+          <w:lang w:val="en-GB"/>
         </w:rPr>
         <w:t>nebo</w:t>
       </w:r>
@@ -1300,7 +1304,7 @@
       <w:r>
         <w:rPr>
           <w:rStyle w:val="dn"/>
-          <w:lang w:val="pl-PL"/>
+          <w:lang w:val="en-GB"/>
         </w:rPr>
         <w:t xml:space="preserve"> §</w:t>
       </w:r>
@@ -1315,7 +1319,7 @@
       <w:r>
         <w:rPr>
           <w:rStyle w:val="dn"/>
-          <w:lang w:val="pl-PL"/>
+          <w:lang w:val="en-GB"/>
         </w:rPr>
         <w:t>20</w:t>
       </w:r>
@@ -1331,7 +1335,7 @@
       <w:r>
         <w:rPr>
           <w:rStyle w:val="dn"/>
-          <w:lang w:val="pl-PL"/>
+          <w:lang w:val="en-GB"/>
         </w:rPr>
         <w:t>odst</w:t>
       </w:r>
@@ -1339,7 +1343,7 @@
       <w:r>
         <w:rPr>
           <w:rStyle w:val="dn"/>
-          <w:lang w:val="pl-PL"/>
+          <w:lang w:val="en-GB"/>
         </w:rPr>
         <w:t>.</w:t>
       </w:r>
@@ -1354,7 +1358,7 @@
       <w:r>
         <w:rPr>
           <w:rStyle w:val="dn"/>
-          <w:lang w:val="pl-PL"/>
+          <w:lang w:val="en-GB"/>
         </w:rPr>
         <w:t xml:space="preserve">8 (pro </w:t>
       </w:r>
@@ -1362,7 +1366,7 @@
       <w:r>
         <w:rPr>
           <w:rStyle w:val="dn"/>
-          <w:lang w:val="pl-PL"/>
+          <w:lang w:val="en-GB"/>
         </w:rPr>
         <w:t>právnick</w:t>
       </w:r>
@@ -1374,31 +1378,40 @@
         </w:rPr>
         <w:t xml:space="preserve">é </w:t>
       </w:r>
-      <w:r>
-        <w:rPr>
-          <w:rStyle w:val="dn"/>
-          <w:lang w:val="pl-PL"/>
-        </w:rPr>
-        <w:t>osoby).</w:t>
-      </w:r>
-    </w:p>
-    <w:p>
-      <w:pPr>
-        <w:rPr>
-          <w:lang w:val="pl-PL"/>
-        </w:rPr>
-      </w:pPr>
-    </w:p>
-    <w:p>
-      <w:pPr>
-        <w:rPr>
-          <w:lang w:val="pl-PL"/>
-        </w:rPr>
-      </w:pPr>
-      <w:r>
-        <w:rPr>
-          <w:rStyle w:val="dn"/>
-          <w:lang w:val="pl-PL"/>
+      <w:proofErr w:type="spellStart"/>
+      <w:r>
+        <w:rPr>
+          <w:rStyle w:val="dn"/>
+          <w:lang w:val="en-GB"/>
+        </w:rPr>
+        <w:t>osoby</w:t>
+      </w:r>
+      <w:proofErr w:type="spellEnd"/>
+      <w:r>
+        <w:rPr>
+          <w:rStyle w:val="dn"/>
+          <w:lang w:val="en-GB"/>
+        </w:rPr>
+        <w:t>).</w:t>
+      </w:r>
+    </w:p>
+    <w:p>
+      <w:pPr>
+        <w:rPr>
+          <w:lang w:val="en-GB"/>
+        </w:rPr>
+      </w:pPr>
+    </w:p>
+    <w:p>
+      <w:pPr>
+        <w:rPr>
+          <w:lang w:val="en-GB"/>
+        </w:rPr>
+      </w:pPr>
+      <w:r>
+        <w:rPr>
+          <w:rStyle w:val="dn"/>
+          <w:lang w:val="en-GB"/>
         </w:rPr>
         <w:t>V </w:t>
       </w:r>
@@ -1406,7 +1419,7 @@
       <w:r>
         <w:rPr>
           <w:rStyle w:val="dn"/>
-          <w:lang w:val="pl-PL"/>
+          <w:lang w:val="en-GB"/>
         </w:rPr>
         <w:t>Zlíně</w:t>
       </w:r>
@@ -1414,7 +1427,7 @@
       <w:r>
         <w:rPr>
           <w:rStyle w:val="dn"/>
-          <w:lang w:val="pl-PL"/>
+          <w:lang w:val="en-GB"/>
         </w:rPr>
         <w:t xml:space="preserve"> </w:t>
       </w:r>
@@ -1422,7 +1435,7 @@
       <w:r>
         <w:rPr>
           <w:rStyle w:val="dn"/>
-          <w:lang w:val="pl-PL"/>
+          <w:lang w:val="en-GB"/>
         </w:rPr>
         <w:t>dne</w:t>
       </w:r>
@@ -1430,43 +1443,52 @@
       <w:r>
         <w:rPr>
           <w:rStyle w:val="dn"/>
-          <w:lang w:val="pl-PL"/>
-        </w:rPr>
-        <w:t xml:space="preserve">: </w:t>
-      </w:r>
-    </w:p>
-    <w:p>
-      <w:pPr>
-        <w:rPr>
-          <w:lang w:val="pl-PL"/>
-        </w:rPr>
-      </w:pPr>
-    </w:p>
-    <w:p>
-      <w:pPr>
-        <w:rPr>
-          <w:lang w:val="pl-PL"/>
-        </w:rPr>
-      </w:pPr>
-    </w:p>
-    <w:p>
-      <w:pPr>
-        <w:rPr>
-          <w:lang w:val="pl-PL"/>
-        </w:rPr>
-      </w:pPr>
-      <w:r>
-        <w:rPr>
-          <w:rStyle w:val="dn"/>
-          <w:lang w:val="pl-PL"/>
-        </w:rPr>
-        <w:t xml:space="preserve">Podpis </w:t>
-      </w:r>
-      <w:proofErr w:type="spellStart"/>
-      <w:r>
-        <w:rPr>
-          <w:rStyle w:val="dn"/>
-          <w:lang w:val="pl-PL"/>
+          <w:lang w:val="en-GB"/>
+        </w:rPr>
+        <w:t>:</w:t>
+      </w:r>
+    </w:p>
+    <w:p>
+      <w:pPr>
+        <w:rPr>
+          <w:lang w:val="en-GB"/>
+        </w:rPr>
+      </w:pPr>
+    </w:p>
+    <w:p>
+      <w:pPr>
+        <w:rPr>
+          <w:lang w:val="en-GB"/>
+        </w:rPr>
+      </w:pPr>
+    </w:p>
+    <w:p>
+      <w:pPr>
+        <w:rPr>
+          <w:lang w:val="en-GB"/>
+        </w:rPr>
+      </w:pPr>
+      <w:proofErr w:type="spellStart"/>
+      <w:r>
+        <w:rPr>
+          <w:rStyle w:val="dn"/>
+          <w:lang w:val="en-GB"/>
+        </w:rPr>
+        <w:t>Podpis</w:t>
+      </w:r>
+      <w:proofErr w:type="spellEnd"/>
+      <w:r>
+        <w:rPr>
+          <w:rStyle w:val="dn"/>
+          <w:lang w:val="en-GB"/>
+        </w:rPr>
+        <w:t xml:space="preserve"> </w:t>
+      </w:r>
+      <w:proofErr w:type="spellStart"/>
+      <w:r>
+        <w:rPr>
+          <w:rStyle w:val="dn"/>
+          <w:lang w:val="en-GB"/>
         </w:rPr>
         <w:t>příjemce</w:t>
       </w:r>
@@ -1474,7 +1496,7 @@
       <w:r>
         <w:rPr>
           <w:rStyle w:val="dn"/>
-          <w:lang w:val="pl-PL"/>
+          <w:lang w:val="en-GB"/>
         </w:rPr>
         <w:t>:</w:t>
       </w:r>
@@ -1482,25 +1504,23 @@
     <w:p>
       <w:pPr>
         <w:rPr>
-          <w:lang w:val="pl-PL"/>
-        </w:rPr>
-      </w:pPr>
-    </w:p>
-    <w:p>
-      <w:pPr>
-        <w:rPr>
-          <w:lang w:val="pl-PL"/>
-        </w:rPr>
-      </w:pPr>
-      <w:proofErr w:type="spellStart"/>
-      <w:r>
-        <w:rPr>
-          <w:rStyle w:val="dn"/>
-          <w:lang w:val="pl-PL"/>
+          <w:lang w:val="en-GB"/>
+        </w:rPr>
+      </w:pPr>
+    </w:p>
+    <w:p>
+      <w:pPr>
+        <w:rPr>
+          <w:lang w:val="en-GB"/>
+        </w:rPr>
+      </w:pPr>
+      <w:r>
+        <w:rPr>
+          <w:rStyle w:val="dn"/>
+          <w:lang w:val="en-GB"/>
         </w:rPr>
         <w:t>Barbora</w:t>
       </w:r>
-      <w:proofErr w:type="spellEnd"/>
       <w:r>
         <w:rPr>
           <w:rStyle w:val="dn"/>
@@ -1509,27 +1529,25 @@
         </w:rPr>
         <w:t> </w:t>
       </w:r>
-      <w:proofErr w:type="spellStart"/>
-      <w:r>
-        <w:rPr>
-          <w:rStyle w:val="dn"/>
-          <w:lang w:val="pl-PL"/>
+      <w:r>
+        <w:rPr>
+          <w:rStyle w:val="dn"/>
+          <w:lang w:val="en-GB"/>
         </w:rPr>
         <w:t>Sládková</w:t>
       </w:r>
-      <w:proofErr w:type="spellEnd"/>
-    </w:p>
-    <w:p>
-      <w:pPr>
-        <w:rPr>
-          <w:lang w:val="pl-PL"/>
-        </w:rPr>
-      </w:pPr>
-      <w:proofErr w:type="spellStart"/>
-      <w:r>
-        <w:rPr>
-          <w:rStyle w:val="dn"/>
-          <w:lang w:val="pl-PL"/>
+    </w:p>
+    <w:p>
+      <w:pPr>
+        <w:rPr>
+          <w:lang w:val="en-GB"/>
+        </w:rPr>
+      </w:pPr>
+      <w:proofErr w:type="spellStart"/>
+      <w:r>
+        <w:rPr>
+          <w:rStyle w:val="dn"/>
+          <w:lang w:val="en-GB"/>
         </w:rPr>
         <w:t>Vý</w:t>
       </w:r>
@@ -1544,7 +1562,7 @@
       <w:r>
         <w:rPr>
           <w:rStyle w:val="dn"/>
-          <w:lang w:val="pl-PL"/>
+          <w:lang w:val="en-GB"/>
         </w:rPr>
         <w:t xml:space="preserve">á </w:t>
       </w:r>
@@ -1552,7 +1570,7 @@
       <w:r>
         <w:rPr>
           <w:rStyle w:val="dn"/>
-          <w:lang w:val="pl-PL"/>
+          <w:lang w:val="en-GB"/>
         </w:rPr>
         <w:t>sekretářka</w:t>
       </w:r>
@@ -1561,46 +1579,37 @@
     <w:p>
       <w:pPr>
         <w:rPr>
-          <w:lang w:val="pl-PL"/>
-        </w:rPr>
-      </w:pPr>
-      <w:proofErr w:type="spellStart"/>
-      <w:r>
-        <w:rPr>
-          <w:rStyle w:val="dn"/>
-          <w:lang w:val="pl-PL"/>
-        </w:rPr>
-        <w:t>Rotary</w:t>
-      </w:r>
-      <w:proofErr w:type="spellEnd"/>
-      <w:r>
-        <w:rPr>
-          <w:rStyle w:val="dn"/>
-          <w:lang w:val="pl-PL"/>
-        </w:rPr>
-        <w:t xml:space="preserve"> klub </w:t>
-      </w:r>
-      <w:proofErr w:type="spellStart"/>
-      <w:r>
-        <w:rPr>
-          <w:rStyle w:val="dn"/>
-          <w:lang w:val="pl-PL"/>
-        </w:rPr>
-        <w:t>Valtice</w:t>
-      </w:r>
-      <w:proofErr w:type="spellEnd"/>
-      <w:r>
-        <w:rPr>
-          <w:rStyle w:val="dn"/>
-          <w:lang w:val="pl-PL"/>
-        </w:rPr>
-        <w:t>–</w:t>
-      </w:r>
-      <w:proofErr w:type="spellStart"/>
-      <w:r>
-        <w:rPr>
-          <w:rStyle w:val="dn"/>
-          <w:lang w:val="pl-PL"/>
+          <w:lang w:val="en-GB"/>
+        </w:rPr>
+      </w:pPr>
+      <w:r>
+        <w:rPr>
+          <w:rStyle w:val="dn"/>
+          <w:lang w:val="en-GB"/>
+        </w:rPr>
+        <w:t xml:space="preserve">Rotary </w:t>
+      </w:r>
+      <w:proofErr w:type="spellStart"/>
+      <w:r>
+        <w:rPr>
+          <w:rStyle w:val="dn"/>
+          <w:lang w:val="en-GB"/>
+        </w:rPr>
+        <w:t>klub</w:t>
+      </w:r>
+      <w:proofErr w:type="spellEnd"/>
+      <w:r>
+        <w:rPr>
+          <w:rStyle w:val="dn"/>
+          <w:lang w:val="en-GB"/>
+        </w:rPr>
+        <w:t xml:space="preserve"> Valtice–</w:t>
+      </w:r>
+      <w:proofErr w:type="spellStart"/>
+      <w:r>
+        <w:rPr>
+          <w:rStyle w:val="dn"/>
+          <w:lang w:val="en-GB"/>
         </w:rPr>
         <w:t>Břeclav</w:t>
       </w:r>
@@ -1608,7 +1617,7 @@
       <w:r>
         <w:rPr>
           <w:rStyle w:val="dn"/>
-          <w:lang w:val="pl-PL"/>
+          <w:lang w:val="en-GB"/>
         </w:rPr>
         <w:t xml:space="preserve">, </w:t>
       </w:r>
@@ -1616,7 +1625,7 @@
       <w:r>
         <w:rPr>
           <w:rStyle w:val="dn"/>
-          <w:lang w:val="pl-PL"/>
+          <w:lang w:val="en-GB"/>
         </w:rPr>
         <w:t>z.s</w:t>
       </w:r>
@@ -1624,7 +1633,7 @@
       <w:r>
         <w:rPr>
           <w:rStyle w:val="dn"/>
-          <w:lang w:val="pl-PL"/>
+          <w:lang w:val="en-GB"/>
         </w:rPr>
         <w:t>.</w:t>
       </w:r>

</xml_diff>